<commit_message>
Evidencias de execucao no Databricks e relatorio final
Co-Authored-By: Claude Sonnet 5.5 <noreply@anthropic.com>
</commit_message>
<xml_diff>
--- a/Relatorio_MVP_Industria_Juros_Lucas_Iwano.docx
+++ b/Relatorio_MVP_Industria_Juros_Lucas_Iwano.docx
@@ -1024,7 +1024,7 @@
         <w:rPr>
           <w:b w:val="0"/>
         </w:rPr>
-        <w:t>Os arquivos brutos ficam versionados no repositório (data/raw). A persistência na plataforma de nuvem (Databricks, Volume do Unity Catalog e tabelas Delta) é feita pelos notebooks 01 e 02, e o status da execução consta na Seção 4.3.</w:t>
+        <w:t>Os dados brutos foram persistidos em um Volume do Unity Catalog (workspace.industria_juros.raw) no Databricks Free Edition e, após o ETL, em quatro tabelas Delta no mesmo esquema (Seção 4.3). O ambiente Free Edition não tem acesso à internet: a chamada às APIs falhou por erro de resolução de DNS. O notebook 01 trata esse caso copiando o bronze versionado no repositório (data/raw), que foi coletado pelo mesmo script coleta.py em 28/09/2026, e o manifesto de coleta (com hash SHA-256) foi gravado junto.</w:t>
       </w:r>
     </w:p>
     <w:p>
@@ -4359,19 +4359,388 @@
         <w:rPr>
           <w:b w:val="0"/>
         </w:rPr>
-        <w:t xml:space="preserve">Status: os notebooks Databricks (notebooks/01, 02 e 03) foram escritos e a lógica que eles executam foi validada localmente, com o mesmo código e as mesmas consultas SQL (o resultado da consulta P1 em SQL bate com o do pandas, diferença 0,0). </w:t>
+        <w:t>Execução realizada em 28/09/2026 no Databricks Free Edition (workspace da conta do aluno, compute serverless), a partir de uma Git folder ligada ao repositório público do GitHub. Os três notebooks foram executados em ordem e as capturas de tela estão referenciadas abaixo.</w:t>
       </w:r>
-      <w:r>
-        <w:rPr>
-          <w:b/>
-        </w:rPr>
-        <w:t>A execução dentro do Databricks ainda não foi realizada nesta versão</w:t>
-      </w:r>
+    </w:p>
+    <w:p>
       <w:r>
         <w:rPr>
           <w:b w:val="0"/>
         </w:rPr>
-        <w:t xml:space="preserve"> porque exige login da própria conta do aluno na plataforma, e não há evidência de nuvem (capturas de tela) neste relatório. Os passos para executar estão no README: criar a conta gratuita Databricks Free Edition, criar uma Git folder apontando para o repositório e executar os três notebooks em ordem. Ao final, o notebook 02 grava as quatro tabelas Delta e o comando DESCRIBE HISTORY comprova a persistência.</w:t>
+        <w:t>Notebook 01 (bronze). O ambiente Free Edition não tem saída para a internet: a primeira execução falhou ao chamar a API do IBGE com erro de resolução de DNS ("Failed to resolve 'apisidra.ibge.gov.br'"). O notebook foi então alterado para tentar a API e, em caso de falha, copiar para o Volume o bronze versionado no repositório, que foi coletado pelo script coleta.py em 28/09/2026 (manifesto com URL, volume e SHA-256). Portanto, a coleta a partir das APIs ocorreu na máquina local, e a persistência na nuvem parte do arquivo bruto. A Figura 7 mostra os seis arquivos no Volume workspace.industria_juros.raw (o JSON da PIM-PF tem 1.650.738 bytes, igual ao manifesto).</w:t>
+      </w:r>
+    </w:p>
+    <w:p>
+      <w:r>
+        <w:rPr>
+          <w:b w:val="0"/>
+        </w:rPr>
+        <w:t>Notebook 02 (silver e gold). O ETL rodou dentro do Databricks e gravou as quatro tabelas Delta em workspace.industria_juros. As contagens de linhas são idênticas às da execução local: dim_tempo 297, dim_atividade 27, fato_producao 7.965 e fato_macro 297 (Figura 8). O DESCRIBE HISTORY da fato_producao mostra a versão 0 criada por CREATE OR REPLACE TABLE AS SELECT, em 28/09/2026, pelo usuário da conta, o que comprova a persistência (Figura 9).</w:t>
+      </w:r>
+    </w:p>
+    <w:p>
+      <w:r>
+        <w:rPr>
+          <w:b w:val="0"/>
+        </w:rPr>
+        <w:t>Notebook 03 (análise). As consultas SQL sobre as tabelas Delta reproduzem os resultados locais: a completude do índice (Figura 10) mostra 120 meses ausentes em 3.18 e 3.33; o P1 em SQL (Figura 11) dá −33,1% para Impressão e −27,0% para Confecção, iguais aos do pandas; o P4 em Spark SQL (Figura 12) dá desvios de 19,6, 17,0, 16,9 e 16,7 p.p. para Fumo, Informática, Veículos e Impressão. A execução de scripts/analise.py sobre as tabelas Delta reproduziu o teste de permutação do P2 (Figura 13): 2.000 permutações, 0 de 27 séries significativas, 11 correlações negativas, e Produtos químicos com r = −0,211, defasagem de 2 meses e p = 0,209, valores idênticos aos da execução local (semente 42).</w:t>
+      </w:r>
+    </w:p>
+    <w:p>
+      <w:pPr>
+        <w:jc w:val="center"/>
+      </w:pPr>
+      <w:r>
+        <w:drawing>
+          <wp:inline xmlns:a="http://schemas.openxmlformats.org/drawingml/2006/main" xmlns:pic="http://schemas.openxmlformats.org/drawingml/2006/picture">
+            <wp:extent cx="5580000" cy="2544905"/>
+            <wp:docPr id="2" name="Picture 2"/>
+            <wp:cNvGraphicFramePr>
+              <a:graphicFrameLocks noChangeAspect="1"/>
+            </wp:cNvGraphicFramePr>
+            <a:graphic>
+              <a:graphicData uri="http://schemas.openxmlformats.org/drawingml/2006/picture">
+                <pic:pic>
+                  <pic:nvPicPr>
+                    <pic:cNvPr id="0" name="nuvem_01_bronze_volume.jpg"/>
+                    <pic:cNvPicPr/>
+                  </pic:nvPicPr>
+                  <pic:blipFill>
+                    <a:blip r:embed="rId10"/>
+                    <a:stretch>
+                      <a:fillRect/>
+                    </a:stretch>
+                  </pic:blipFill>
+                  <pic:spPr>
+                    <a:xfrm>
+                      <a:off x="0" y="0"/>
+                      <a:ext cx="5580000" cy="2544905"/>
+                    </a:xfrm>
+                    <a:prstGeom prst="rect"/>
+                  </pic:spPr>
+                </pic:pic>
+              </a:graphicData>
+            </a:graphic>
+          </wp:inline>
+        </w:drawing>
+      </w:r>
+    </w:p>
+    <w:p>
+      <w:pPr>
+        <w:jc w:val="center"/>
+      </w:pPr>
+      <w:r>
+        <w:rPr>
+          <w:i/>
+          <w:sz w:val="18"/>
+        </w:rPr>
+        <w:t>Figura 7 — Notebook 01: arquivos brutos no Volume workspace.industria_juros.raw.</w:t>
+      </w:r>
+    </w:p>
+    <w:p>
+      <w:pPr>
+        <w:jc w:val="center"/>
+      </w:pPr>
+      <w:r>
+        <w:drawing>
+          <wp:inline xmlns:a="http://schemas.openxmlformats.org/drawingml/2006/main" xmlns:pic="http://schemas.openxmlformats.org/drawingml/2006/picture">
+            <wp:extent cx="5580000" cy="2544905"/>
+            <wp:docPr id="3" name="Picture 3"/>
+            <wp:cNvGraphicFramePr>
+              <a:graphicFrameLocks noChangeAspect="1"/>
+            </wp:cNvGraphicFramePr>
+            <a:graphic>
+              <a:graphicData uri="http://schemas.openxmlformats.org/drawingml/2006/picture">
+                <pic:pic>
+                  <pic:nvPicPr>
+                    <pic:cNvPr id="0" name="nuvem_02_tabelas_delta_contagem.jpg"/>
+                    <pic:cNvPicPr/>
+                  </pic:nvPicPr>
+                  <pic:blipFill>
+                    <a:blip r:embed="rId11"/>
+                    <a:stretch>
+                      <a:fillRect/>
+                    </a:stretch>
+                  </pic:blipFill>
+                  <pic:spPr>
+                    <a:xfrm>
+                      <a:off x="0" y="0"/>
+                      <a:ext cx="5580000" cy="2544905"/>
+                    </a:xfrm>
+                    <a:prstGeom prst="rect"/>
+                  </pic:spPr>
+                </pic:pic>
+              </a:graphicData>
+            </a:graphic>
+          </wp:inline>
+        </w:drawing>
+      </w:r>
+    </w:p>
+    <w:p>
+      <w:pPr>
+        <w:jc w:val="center"/>
+      </w:pPr>
+      <w:r>
+        <w:rPr>
+          <w:i/>
+          <w:sz w:val="18"/>
+        </w:rPr>
+        <w:t>Figura 8 — Notebook 02: contagem das quatro tabelas Delta após a carga.</w:t>
+      </w:r>
+    </w:p>
+    <w:p>
+      <w:pPr>
+        <w:jc w:val="center"/>
+      </w:pPr>
+      <w:r>
+        <w:drawing>
+          <wp:inline xmlns:a="http://schemas.openxmlformats.org/drawingml/2006/main" xmlns:pic="http://schemas.openxmlformats.org/drawingml/2006/picture">
+            <wp:extent cx="5580000" cy="2544905"/>
+            <wp:docPr id="4" name="Picture 4"/>
+            <wp:cNvGraphicFramePr>
+              <a:graphicFrameLocks noChangeAspect="1"/>
+            </wp:cNvGraphicFramePr>
+            <a:graphic>
+              <a:graphicData uri="http://schemas.openxmlformats.org/drawingml/2006/picture">
+                <pic:pic>
+                  <pic:nvPicPr>
+                    <pic:cNvPr id="0" name="nuvem_02_delta_describe_history.jpg"/>
+                    <pic:cNvPicPr/>
+                  </pic:nvPicPr>
+                  <pic:blipFill>
+                    <a:blip r:embed="rId12"/>
+                    <a:stretch>
+                      <a:fillRect/>
+                    </a:stretch>
+                  </pic:blipFill>
+                  <pic:spPr>
+                    <a:xfrm>
+                      <a:off x="0" y="0"/>
+                      <a:ext cx="5580000" cy="2544905"/>
+                    </a:xfrm>
+                    <a:prstGeom prst="rect"/>
+                  </pic:spPr>
+                </pic:pic>
+              </a:graphicData>
+            </a:graphic>
+          </wp:inline>
+        </w:drawing>
+      </w:r>
+    </w:p>
+    <w:p>
+      <w:pPr>
+        <w:jc w:val="center"/>
+      </w:pPr>
+      <w:r>
+        <w:rPr>
+          <w:i/>
+          <w:sz w:val="18"/>
+        </w:rPr>
+        <w:t>Figura 9 — Notebook 02: DESCRIBE HISTORY da fato_producao (persistência Delta).</w:t>
+      </w:r>
+    </w:p>
+    <w:p>
+      <w:pPr>
+        <w:jc w:val="center"/>
+      </w:pPr>
+      <w:r>
+        <w:drawing>
+          <wp:inline xmlns:a="http://schemas.openxmlformats.org/drawingml/2006/main" xmlns:pic="http://schemas.openxmlformats.org/drawingml/2006/picture">
+            <wp:extent cx="5580000" cy="2544905"/>
+            <wp:docPr id="5" name="Picture 5"/>
+            <wp:cNvGraphicFramePr>
+              <a:graphicFrameLocks noChangeAspect="1"/>
+            </wp:cNvGraphicFramePr>
+            <a:graphic>
+              <a:graphicData uri="http://schemas.openxmlformats.org/drawingml/2006/picture">
+                <pic:pic>
+                  <pic:nvPicPr>
+                    <pic:cNvPr id="0" name="nuvem_03_qualidade_sql.jpg"/>
+                    <pic:cNvPicPr/>
+                  </pic:nvPicPr>
+                  <pic:blipFill>
+                    <a:blip r:embed="rId13"/>
+                    <a:stretch>
+                      <a:fillRect/>
+                    </a:stretch>
+                  </pic:blipFill>
+                  <pic:spPr>
+                    <a:xfrm>
+                      <a:off x="0" y="0"/>
+                      <a:ext cx="5580000" cy="2544905"/>
+                    </a:xfrm>
+                    <a:prstGeom prst="rect"/>
+                  </pic:spPr>
+                </pic:pic>
+              </a:graphicData>
+            </a:graphic>
+          </wp:inline>
+        </w:drawing>
+      </w:r>
+    </w:p>
+    <w:p>
+      <w:pPr>
+        <w:jc w:val="center"/>
+      </w:pPr>
+      <w:r>
+        <w:rPr>
+          <w:i/>
+          <w:sz w:val="18"/>
+        </w:rPr>
+        <w:t>Figura 10 — Notebook 03: qualidade do índice por atividade, em SQL sobre o Delta.</w:t>
+      </w:r>
+    </w:p>
+    <w:p>
+      <w:pPr>
+        <w:jc w:val="center"/>
+      </w:pPr>
+      <w:r>
+        <w:drawing>
+          <wp:inline xmlns:a="http://schemas.openxmlformats.org/drawingml/2006/main" xmlns:pic="http://schemas.openxmlformats.org/drawingml/2006/picture">
+            <wp:extent cx="5580000" cy="2544905"/>
+            <wp:docPr id="6" name="Picture 6"/>
+            <wp:cNvGraphicFramePr>
+              <a:graphicFrameLocks noChangeAspect="1"/>
+            </wp:cNvGraphicFramePr>
+            <a:graphic>
+              <a:graphicData uri="http://schemas.openxmlformats.org/drawingml/2006/picture">
+                <pic:pic>
+                  <pic:nvPicPr>
+                    <pic:cNvPr id="0" name="nuvem_03_P1_recuperacao_sql.jpg"/>
+                    <pic:cNvPicPr/>
+                  </pic:nvPicPr>
+                  <pic:blipFill>
+                    <a:blip r:embed="rId14"/>
+                    <a:stretch>
+                      <a:fillRect/>
+                    </a:stretch>
+                  </pic:blipFill>
+                  <pic:spPr>
+                    <a:xfrm>
+                      <a:off x="0" y="0"/>
+                      <a:ext cx="5580000" cy="2544905"/>
+                    </a:xfrm>
+                    <a:prstGeom prst="rect"/>
+                  </pic:spPr>
+                </pic:pic>
+              </a:graphicData>
+            </a:graphic>
+          </wp:inline>
+        </w:drawing>
+      </w:r>
+    </w:p>
+    <w:p>
+      <w:pPr>
+        <w:jc w:val="center"/>
+      </w:pPr>
+      <w:r>
+        <w:rPr>
+          <w:i/>
+          <w:sz w:val="18"/>
+        </w:rPr>
+        <w:t>Figura 11 — Notebook 03: P1 em SQL (variação vs. média de 2019).</w:t>
+      </w:r>
+    </w:p>
+    <w:p>
+      <w:pPr>
+        <w:jc w:val="center"/>
+      </w:pPr>
+      <w:r>
+        <w:drawing>
+          <wp:inline xmlns:a="http://schemas.openxmlformats.org/drawingml/2006/main" xmlns:pic="http://schemas.openxmlformats.org/drawingml/2006/picture">
+            <wp:extent cx="5580000" cy="2544905"/>
+            <wp:docPr id="7" name="Picture 7"/>
+            <wp:cNvGraphicFramePr>
+              <a:graphicFrameLocks noChangeAspect="1"/>
+            </wp:cNvGraphicFramePr>
+            <a:graphic>
+              <a:graphicData uri="http://schemas.openxmlformats.org/drawingml/2006/picture">
+                <pic:pic>
+                  <pic:nvPicPr>
+                    <pic:cNvPr id="0" name="nuvem_03_P4_volatilidade_sql.jpg"/>
+                    <pic:cNvPicPr/>
+                  </pic:nvPicPr>
+                  <pic:blipFill>
+                    <a:blip r:embed="rId15"/>
+                    <a:stretch>
+                      <a:fillRect/>
+                    </a:stretch>
+                  </pic:blipFill>
+                  <pic:spPr>
+                    <a:xfrm>
+                      <a:off x="0" y="0"/>
+                      <a:ext cx="5580000" cy="2544905"/>
+                    </a:xfrm>
+                    <a:prstGeom prst="rect"/>
+                  </pic:spPr>
+                </pic:pic>
+              </a:graphicData>
+            </a:graphic>
+          </wp:inline>
+        </w:drawing>
+      </w:r>
+    </w:p>
+    <w:p>
+      <w:pPr>
+        <w:jc w:val="center"/>
+      </w:pPr>
+      <w:r>
+        <w:rPr>
+          <w:i/>
+          <w:sz w:val="18"/>
+        </w:rPr>
+        <w:t>Figura 12 — Notebook 03: P4 em SQL (desvio-padrão do crescimento anual).</w:t>
+      </w:r>
+    </w:p>
+    <w:p>
+      <w:pPr>
+        <w:jc w:val="center"/>
+      </w:pPr>
+      <w:r>
+        <w:drawing>
+          <wp:inline xmlns:a="http://schemas.openxmlformats.org/drawingml/2006/main" xmlns:pic="http://schemas.openxmlformats.org/drawingml/2006/picture">
+            <wp:extent cx="5580000" cy="2544905"/>
+            <wp:docPr id="8" name="Picture 8"/>
+            <wp:cNvGraphicFramePr>
+              <a:graphicFrameLocks noChangeAspect="1"/>
+            </wp:cNvGraphicFramePr>
+            <a:graphic>
+              <a:graphicData uri="http://schemas.openxmlformats.org/drawingml/2006/picture">
+                <pic:pic>
+                  <pic:nvPicPr>
+                    <pic:cNvPr id="0" name="nuvem_03_P2_analise_python.jpg"/>
+                    <pic:cNvPicPr/>
+                  </pic:nvPicPr>
+                  <pic:blipFill>
+                    <a:blip r:embed="rId16"/>
+                    <a:stretch>
+                      <a:fillRect/>
+                    </a:stretch>
+                  </pic:blipFill>
+                  <pic:spPr>
+                    <a:xfrm>
+                      <a:off x="0" y="0"/>
+                      <a:ext cx="5580000" cy="2544905"/>
+                    </a:xfrm>
+                    <a:prstGeom prst="rect"/>
+                  </pic:spPr>
+                </pic:pic>
+              </a:graphicData>
+            </a:graphic>
+          </wp:inline>
+        </w:drawing>
+      </w:r>
+    </w:p>
+    <w:p>
+      <w:pPr>
+        <w:jc w:val="center"/>
+      </w:pPr>
+      <w:r>
+        <w:rPr>
+          <w:i/>
+          <w:sz w:val="18"/>
+        </w:rPr>
+        <w:t>Figura 13 — Notebook 03: saída do P2 executado sobre as tabelas Delta.</w:t>
       </w:r>
     </w:p>
     <w:p>
@@ -4840,7 +5209,7 @@
         <w:drawing>
           <wp:inline xmlns:a="http://schemas.openxmlformats.org/drawingml/2006/main" xmlns:pic="http://schemas.openxmlformats.org/drawingml/2006/picture">
             <wp:extent cx="5580000" cy="1612000"/>
-            <wp:docPr id="2" name="Picture 2"/>
+            <wp:docPr id="9" name="Picture 9"/>
             <wp:cNvGraphicFramePr>
               <a:graphicFrameLocks noChangeAspect="1"/>
             </wp:cNvGraphicFramePr>
@@ -4852,7 +5221,7 @@
                     <pic:cNvPicPr/>
                   </pic:nvPicPr>
                   <pic:blipFill>
-                    <a:blip r:embed="rId10"/>
+                    <a:blip r:embed="rId17"/>
                     <a:stretch>
                       <a:fillRect/>
                     </a:stretch>
@@ -4899,7 +5268,7 @@
         <w:drawing>
           <wp:inline xmlns:a="http://schemas.openxmlformats.org/drawingml/2006/main" xmlns:pic="http://schemas.openxmlformats.org/drawingml/2006/picture">
             <wp:extent cx="5580000" cy="2604000"/>
-            <wp:docPr id="3" name="Picture 3"/>
+            <wp:docPr id="10" name="Picture 10"/>
             <wp:cNvGraphicFramePr>
               <a:graphicFrameLocks noChangeAspect="1"/>
             </wp:cNvGraphicFramePr>
@@ -4911,7 +5280,7 @@
                     <pic:cNvPicPr/>
                   </pic:nvPicPr>
                   <pic:blipFill>
-                    <a:blip r:embed="rId11"/>
+                    <a:blip r:embed="rId18"/>
                     <a:stretch>
                       <a:fillRect/>
                     </a:stretch>
@@ -4974,7 +5343,7 @@
         <w:drawing>
           <wp:inline xmlns:a="http://schemas.openxmlformats.org/drawingml/2006/main" xmlns:pic="http://schemas.openxmlformats.org/drawingml/2006/picture">
             <wp:extent cx="5580000" cy="4092000"/>
-            <wp:docPr id="4" name="Picture 4"/>
+            <wp:docPr id="11" name="Picture 11"/>
             <wp:cNvGraphicFramePr>
               <a:graphicFrameLocks noChangeAspect="1"/>
             </wp:cNvGraphicFramePr>
@@ -4986,7 +5355,7 @@
                     <pic:cNvPicPr/>
                   </pic:nvPicPr>
                   <pic:blipFill>
-                    <a:blip r:embed="rId12"/>
+                    <a:blip r:embed="rId19"/>
                     <a:stretch>
                       <a:fillRect/>
                     </a:stretch>
@@ -5881,7 +6250,7 @@
         <w:drawing>
           <wp:inline xmlns:a="http://schemas.openxmlformats.org/drawingml/2006/main" xmlns:pic="http://schemas.openxmlformats.org/drawingml/2006/picture">
             <wp:extent cx="5580000" cy="4092000"/>
-            <wp:docPr id="5" name="Picture 5"/>
+            <wp:docPr id="12" name="Picture 12"/>
             <wp:cNvGraphicFramePr>
               <a:graphicFrameLocks noChangeAspect="1"/>
             </wp:cNvGraphicFramePr>
@@ -5893,7 +6262,7 @@
                     <pic:cNvPicPr/>
                   </pic:nvPicPr>
                   <pic:blipFill>
-                    <a:blip r:embed="rId13"/>
+                    <a:blip r:embed="rId20"/>
                     <a:stretch>
                       <a:fillRect/>
                     </a:stretch>
@@ -6456,7 +6825,7 @@
         <w:drawing>
           <wp:inline xmlns:a="http://schemas.openxmlformats.org/drawingml/2006/main" xmlns:pic="http://schemas.openxmlformats.org/drawingml/2006/picture">
             <wp:extent cx="5580000" cy="3348000"/>
-            <wp:docPr id="6" name="Picture 6"/>
+            <wp:docPr id="13" name="Picture 13"/>
             <wp:cNvGraphicFramePr>
               <a:graphicFrameLocks noChangeAspect="1"/>
             </wp:cNvGraphicFramePr>
@@ -6468,7 +6837,7 @@
                     <pic:cNvPicPr/>
                   </pic:nvPicPr>
                   <pic:blipFill>
-                    <a:blip r:embed="rId14"/>
+                    <a:blip r:embed="rId21"/>
                     <a:stretch>
                       <a:fillRect/>
                     </a:stretch>
@@ -6931,7 +7300,7 @@
         <w:drawing>
           <wp:inline xmlns:a="http://schemas.openxmlformats.org/drawingml/2006/main" xmlns:pic="http://schemas.openxmlformats.org/drawingml/2006/picture">
             <wp:extent cx="5580000" cy="3472000"/>
-            <wp:docPr id="7" name="Picture 7"/>
+            <wp:docPr id="14" name="Picture 14"/>
             <wp:cNvGraphicFramePr>
               <a:graphicFrameLocks noChangeAspect="1"/>
             </wp:cNvGraphicFramePr>
@@ -6943,7 +7312,7 @@
                     <pic:cNvPicPr/>
                   </pic:nvPicPr>
                   <pic:blipFill>
-                    <a:blip r:embed="rId15"/>
+                    <a:blip r:embed="rId22"/>
                     <a:stretch>
                       <a:fillRect/>
                     </a:stretch>
@@ -7517,7 +7886,7 @@
         <w:pStyle w:val="ListBullet"/>
       </w:pPr>
       <w:r>
-        <w:t>Que decisões técnicas tomaria de outra forma? Testaria o pipeline no Databricks desde o primeiro dia, em vez de validá-lo localmente antes, o que evitaria retrabalho na integração. Usaria a série com ajuste sazonal que o IBGE também divulga e um modelo em primeiras diferenças ou VAR, mais adequado a séries persistentes. Incluiria ao menos uma variável de crédito (concessões do BCB) e uma de demanda externa.</w:t>
+        <w:t>Que decisões técnicas tomaria de outra forma? Testaria o pipeline no Databricks desde o primeiro dia, em vez de validá-lo localmente antes. Só na execução real apareceu que o Free Edition não acessa a internet, o que obrigou a separar a coleta (local) da persistência (nuvem) e adaptar o notebook 01; descobrir isso cedo teria orientado o desenho da coleta. Usaria a série com ajuste sazonal que o IBGE também divulga e um modelo em primeiras diferenças ou VAR, mais adequado a séries persistentes. Incluiria ao menos uma variável de crédito (concessões do BCB) e uma de demanda externa.</w:t>
       </w:r>
     </w:p>
     <w:p>
@@ -7557,7 +7926,7 @@
         <w:pStyle w:val="ListBullet"/>
       </w:pPr>
       <w:r>
-        <w:t>Databricks: criar uma Git folder com o repositório e executar notebooks/01, 02 e 03 em ordem. Os notebooks usam catalog workspace e schema industria_juros.</w:t>
+        <w:t>Databricks: criar uma Git folder com o repositório e executar notebooks/01, 02 e 03 em ordem. Os notebooks usam catalog workspace e schema industria_juros. O Free Edition não tem acesso à internet: o notebook 01 tenta a API e, se falhar, usa o bronze versionado em data/raw.</w:t>
       </w:r>
     </w:p>
     <w:p>

</xml_diff>